<commit_message>
Exception Handling Interview Questions added
</commit_message>
<xml_diff>
--- a/Interview Questions/5. Functional Programming Questions.docx
+++ b/Interview Questions/5. Functional Programming Questions.docx
@@ -68,7 +68,6 @@
           <w:bCs/>
           <w:noProof/>
           <w:color w:val="1F4E79" w:themeColor="accent5" w:themeShade="80"/>
-          <w:sz w:val="20"/>
           <w:lang w:val="en-US"/>
         </w:rPr>
       </w:sdtEndPr>
@@ -95,6 +94,10 @@
         <w:p>
           <w:pPr>
             <w:pStyle w:val="TOC1"/>
+            <w:numPr>
+              <w:ilvl w:val="0"/>
+              <w:numId w:val="21"/>
+            </w:numPr>
             <w:tabs>
               <w:tab w:val="right" w:leader="dot" w:pos="10456"/>
             </w:tabs>
@@ -104,7 +107,7 @@
               <w:b/>
               <w:noProof/>
               <w:color w:val="1F4E79" w:themeColor="accent5" w:themeShade="80"/>
-              <w:sz w:val="24"/>
+              <w:sz w:val="28"/>
               <w:lang w:val="en-IN" w:eastAsia="en-IN"/>
             </w:rPr>
           </w:pPr>
@@ -113,7 +116,7 @@
               <w:rFonts w:ascii="Comic Sans MS" w:hAnsi="Comic Sans MS"/>
               <w:b/>
               <w:color w:val="1F4E79" w:themeColor="accent5" w:themeShade="80"/>
-              <w:sz w:val="28"/>
+              <w:sz w:val="32"/>
             </w:rPr>
             <w:fldChar w:fldCharType="begin"/>
           </w:r>
@@ -122,7 +125,7 @@
               <w:rFonts w:ascii="Comic Sans MS" w:hAnsi="Comic Sans MS"/>
               <w:b/>
               <w:color w:val="1F4E79" w:themeColor="accent5" w:themeShade="80"/>
-              <w:sz w:val="28"/>
+              <w:sz w:val="32"/>
             </w:rPr>
             <w:instrText xml:space="preserve"> TOC \o "1-3" \h \z \u </w:instrText>
           </w:r>
@@ -131,7 +134,7 @@
               <w:rFonts w:ascii="Comic Sans MS" w:hAnsi="Comic Sans MS"/>
               <w:b/>
               <w:color w:val="1F4E79" w:themeColor="accent5" w:themeShade="80"/>
-              <w:sz w:val="28"/>
+              <w:sz w:val="32"/>
             </w:rPr>
             <w:fldChar w:fldCharType="separate"/>
           </w:r>
@@ -143,7 +146,7 @@
                 <w:b/>
                 <w:noProof/>
                 <w:color w:val="1F4E79" w:themeColor="accent5" w:themeShade="80"/>
-                <w:sz w:val="24"/>
+                <w:sz w:val="28"/>
               </w:rPr>
               <w:t>Functional Interfaces</w:t>
             </w:r>
@@ -153,7 +156,7 @@
                 <w:noProof/>
                 <w:webHidden/>
                 <w:color w:val="1F4E79" w:themeColor="accent5" w:themeShade="80"/>
-                <w:sz w:val="24"/>
+                <w:sz w:val="28"/>
               </w:rPr>
               <w:tab/>
             </w:r>
@@ -163,7 +166,7 @@
                 <w:noProof/>
                 <w:webHidden/>
                 <w:color w:val="1F4E79" w:themeColor="accent5" w:themeShade="80"/>
-                <w:sz w:val="24"/>
+                <w:sz w:val="28"/>
               </w:rPr>
               <w:fldChar w:fldCharType="begin"/>
             </w:r>
@@ -173,7 +176,7 @@
                 <w:noProof/>
                 <w:webHidden/>
                 <w:color w:val="1F4E79" w:themeColor="accent5" w:themeShade="80"/>
-                <w:sz w:val="24"/>
+                <w:sz w:val="28"/>
               </w:rPr>
               <w:instrText xml:space="preserve"> PAGEREF _Toc240363944 \h </w:instrText>
             </w:r>
@@ -183,7 +186,7 @@
                 <w:noProof/>
                 <w:webHidden/>
                 <w:color w:val="1F4E79" w:themeColor="accent5" w:themeShade="80"/>
-                <w:sz w:val="24"/>
+                <w:sz w:val="28"/>
               </w:rPr>
             </w:r>
             <w:r>
@@ -192,7 +195,7 @@
                 <w:noProof/>
                 <w:webHidden/>
                 <w:color w:val="1F4E79" w:themeColor="accent5" w:themeShade="80"/>
-                <w:sz w:val="24"/>
+                <w:sz w:val="28"/>
               </w:rPr>
               <w:fldChar w:fldCharType="separate"/>
             </w:r>
@@ -202,7 +205,7 @@
                 <w:noProof/>
                 <w:webHidden/>
                 <w:color w:val="1F4E79" w:themeColor="accent5" w:themeShade="80"/>
-                <w:sz w:val="24"/>
+                <w:sz w:val="28"/>
               </w:rPr>
               <w:t>1</w:t>
             </w:r>
@@ -212,7 +215,7 @@
                 <w:noProof/>
                 <w:webHidden/>
                 <w:color w:val="1F4E79" w:themeColor="accent5" w:themeShade="80"/>
-                <w:sz w:val="24"/>
+                <w:sz w:val="28"/>
               </w:rPr>
               <w:fldChar w:fldCharType="end"/>
             </w:r>
@@ -221,6 +224,10 @@
         <w:p>
           <w:pPr>
             <w:pStyle w:val="TOC1"/>
+            <w:numPr>
+              <w:ilvl w:val="0"/>
+              <w:numId w:val="21"/>
+            </w:numPr>
             <w:tabs>
               <w:tab w:val="right" w:leader="dot" w:pos="10456"/>
             </w:tabs>
@@ -230,7 +237,7 @@
               <w:b/>
               <w:noProof/>
               <w:color w:val="1F4E79" w:themeColor="accent5" w:themeShade="80"/>
-              <w:sz w:val="24"/>
+              <w:sz w:val="28"/>
               <w:lang w:val="en-IN" w:eastAsia="en-IN"/>
             </w:rPr>
           </w:pPr>
@@ -242,7 +249,7 @@
                 <w:b/>
                 <w:noProof/>
                 <w:color w:val="1F4E79" w:themeColor="accent5" w:themeShade="80"/>
-                <w:sz w:val="24"/>
+                <w:sz w:val="28"/>
               </w:rPr>
               <w:t>Lambda</w:t>
             </w:r>
@@ -252,7 +259,7 @@
                 <w:noProof/>
                 <w:webHidden/>
                 <w:color w:val="1F4E79" w:themeColor="accent5" w:themeShade="80"/>
-                <w:sz w:val="24"/>
+                <w:sz w:val="28"/>
               </w:rPr>
               <w:tab/>
             </w:r>
@@ -262,7 +269,7 @@
                 <w:noProof/>
                 <w:webHidden/>
                 <w:color w:val="1F4E79" w:themeColor="accent5" w:themeShade="80"/>
-                <w:sz w:val="24"/>
+                <w:sz w:val="28"/>
               </w:rPr>
               <w:fldChar w:fldCharType="begin"/>
             </w:r>
@@ -272,7 +279,7 @@
                 <w:noProof/>
                 <w:webHidden/>
                 <w:color w:val="1F4E79" w:themeColor="accent5" w:themeShade="80"/>
-                <w:sz w:val="24"/>
+                <w:sz w:val="28"/>
               </w:rPr>
               <w:instrText xml:space="preserve"> PAGEREF _Toc240363946 \h </w:instrText>
             </w:r>
@@ -282,7 +289,7 @@
                 <w:noProof/>
                 <w:webHidden/>
                 <w:color w:val="1F4E79" w:themeColor="accent5" w:themeShade="80"/>
-                <w:sz w:val="24"/>
+                <w:sz w:val="28"/>
               </w:rPr>
             </w:r>
             <w:r>
@@ -291,7 +298,7 @@
                 <w:noProof/>
                 <w:webHidden/>
                 <w:color w:val="1F4E79" w:themeColor="accent5" w:themeShade="80"/>
-                <w:sz w:val="24"/>
+                <w:sz w:val="28"/>
               </w:rPr>
               <w:fldChar w:fldCharType="separate"/>
             </w:r>
@@ -301,7 +308,7 @@
                 <w:noProof/>
                 <w:webHidden/>
                 <w:color w:val="1F4E79" w:themeColor="accent5" w:themeShade="80"/>
-                <w:sz w:val="24"/>
+                <w:sz w:val="28"/>
               </w:rPr>
               <w:t>2</w:t>
             </w:r>
@@ -311,7 +318,7 @@
                 <w:noProof/>
                 <w:webHidden/>
                 <w:color w:val="1F4E79" w:themeColor="accent5" w:themeShade="80"/>
-                <w:sz w:val="24"/>
+                <w:sz w:val="28"/>
               </w:rPr>
               <w:fldChar w:fldCharType="end"/>
             </w:r>
@@ -320,6 +327,10 @@
         <w:p>
           <w:pPr>
             <w:pStyle w:val="TOC1"/>
+            <w:numPr>
+              <w:ilvl w:val="0"/>
+              <w:numId w:val="21"/>
+            </w:numPr>
             <w:tabs>
               <w:tab w:val="right" w:leader="dot" w:pos="10456"/>
             </w:tabs>
@@ -329,7 +340,7 @@
               <w:b/>
               <w:noProof/>
               <w:color w:val="1F4E79" w:themeColor="accent5" w:themeShade="80"/>
-              <w:sz w:val="24"/>
+              <w:sz w:val="28"/>
               <w:lang w:val="en-IN" w:eastAsia="en-IN"/>
             </w:rPr>
           </w:pPr>
@@ -341,7 +352,7 @@
                 <w:b/>
                 <w:noProof/>
                 <w:color w:val="1F4E79" w:themeColor="accent5" w:themeShade="80"/>
-                <w:sz w:val="24"/>
+                <w:sz w:val="28"/>
               </w:rPr>
               <w:t>Streams</w:t>
             </w:r>
@@ -351,7 +362,7 @@
                 <w:noProof/>
                 <w:webHidden/>
                 <w:color w:val="1F4E79" w:themeColor="accent5" w:themeShade="80"/>
-                <w:sz w:val="24"/>
+                <w:sz w:val="28"/>
               </w:rPr>
               <w:tab/>
             </w:r>
@@ -361,7 +372,7 @@
                 <w:noProof/>
                 <w:webHidden/>
                 <w:color w:val="1F4E79" w:themeColor="accent5" w:themeShade="80"/>
-                <w:sz w:val="24"/>
+                <w:sz w:val="28"/>
               </w:rPr>
               <w:fldChar w:fldCharType="begin"/>
             </w:r>
@@ -371,7 +382,7 @@
                 <w:noProof/>
                 <w:webHidden/>
                 <w:color w:val="1F4E79" w:themeColor="accent5" w:themeShade="80"/>
-                <w:sz w:val="24"/>
+                <w:sz w:val="28"/>
               </w:rPr>
               <w:instrText xml:space="preserve"> PAGEREF _Toc240363948 \h </w:instrText>
             </w:r>
@@ -381,7 +392,7 @@
                 <w:noProof/>
                 <w:webHidden/>
                 <w:color w:val="1F4E79" w:themeColor="accent5" w:themeShade="80"/>
-                <w:sz w:val="24"/>
+                <w:sz w:val="28"/>
               </w:rPr>
             </w:r>
             <w:r>
@@ -390,7 +401,7 @@
                 <w:noProof/>
                 <w:webHidden/>
                 <w:color w:val="1F4E79" w:themeColor="accent5" w:themeShade="80"/>
-                <w:sz w:val="24"/>
+                <w:sz w:val="28"/>
               </w:rPr>
               <w:fldChar w:fldCharType="separate"/>
             </w:r>
@@ -400,7 +411,7 @@
                 <w:noProof/>
                 <w:webHidden/>
                 <w:color w:val="1F4E79" w:themeColor="accent5" w:themeShade="80"/>
-                <w:sz w:val="24"/>
+                <w:sz w:val="28"/>
               </w:rPr>
               <w:t>4</w:t>
             </w:r>
@@ -410,7 +421,7 @@
                 <w:noProof/>
                 <w:webHidden/>
                 <w:color w:val="1F4E79" w:themeColor="accent5" w:themeShade="80"/>
-                <w:sz w:val="24"/>
+                <w:sz w:val="28"/>
               </w:rPr>
               <w:fldChar w:fldCharType="end"/>
             </w:r>
@@ -419,6 +430,10 @@
         <w:p>
           <w:pPr>
             <w:pStyle w:val="TOC1"/>
+            <w:numPr>
+              <w:ilvl w:val="0"/>
+              <w:numId w:val="21"/>
+            </w:numPr>
             <w:tabs>
               <w:tab w:val="right" w:leader="dot" w:pos="10456"/>
             </w:tabs>
@@ -428,7 +443,7 @@
               <w:b/>
               <w:noProof/>
               <w:color w:val="1F4E79" w:themeColor="accent5" w:themeShade="80"/>
-              <w:sz w:val="24"/>
+              <w:sz w:val="28"/>
               <w:lang w:val="en-IN" w:eastAsia="en-IN"/>
             </w:rPr>
           </w:pPr>
@@ -440,7 +455,7 @@
                 <w:b/>
                 <w:noProof/>
                 <w:color w:val="1F4E79" w:themeColor="accent5" w:themeShade="80"/>
-                <w:sz w:val="24"/>
+                <w:sz w:val="28"/>
               </w:rPr>
               <w:t>Optional</w:t>
             </w:r>
@@ -450,7 +465,7 @@
                 <w:noProof/>
                 <w:webHidden/>
                 <w:color w:val="1F4E79" w:themeColor="accent5" w:themeShade="80"/>
-                <w:sz w:val="24"/>
+                <w:sz w:val="28"/>
               </w:rPr>
               <w:tab/>
             </w:r>
@@ -460,7 +475,7 @@
                 <w:noProof/>
                 <w:webHidden/>
                 <w:color w:val="1F4E79" w:themeColor="accent5" w:themeShade="80"/>
-                <w:sz w:val="24"/>
+                <w:sz w:val="28"/>
               </w:rPr>
               <w:fldChar w:fldCharType="begin"/>
             </w:r>
@@ -470,7 +485,7 @@
                 <w:noProof/>
                 <w:webHidden/>
                 <w:color w:val="1F4E79" w:themeColor="accent5" w:themeShade="80"/>
-                <w:sz w:val="24"/>
+                <w:sz w:val="28"/>
               </w:rPr>
               <w:instrText xml:space="preserve"> PAGEREF _Toc240363950 \h </w:instrText>
             </w:r>
@@ -480,7 +495,7 @@
                 <w:noProof/>
                 <w:webHidden/>
                 <w:color w:val="1F4E79" w:themeColor="accent5" w:themeShade="80"/>
-                <w:sz w:val="24"/>
+                <w:sz w:val="28"/>
               </w:rPr>
             </w:r>
             <w:r>
@@ -489,7 +504,7 @@
                 <w:noProof/>
                 <w:webHidden/>
                 <w:color w:val="1F4E79" w:themeColor="accent5" w:themeShade="80"/>
-                <w:sz w:val="24"/>
+                <w:sz w:val="28"/>
               </w:rPr>
               <w:fldChar w:fldCharType="separate"/>
             </w:r>
@@ -499,7 +514,7 @@
                 <w:noProof/>
                 <w:webHidden/>
                 <w:color w:val="1F4E79" w:themeColor="accent5" w:themeShade="80"/>
-                <w:sz w:val="24"/>
+                <w:sz w:val="28"/>
               </w:rPr>
               <w:t>5</w:t>
             </w:r>
@@ -509,7 +524,7 @@
                 <w:noProof/>
                 <w:webHidden/>
                 <w:color w:val="1F4E79" w:themeColor="accent5" w:themeShade="80"/>
-                <w:sz w:val="24"/>
+                <w:sz w:val="28"/>
               </w:rPr>
               <w:fldChar w:fldCharType="end"/>
             </w:r>
@@ -518,6 +533,10 @@
         <w:p>
           <w:pPr>
             <w:pStyle w:val="TOC1"/>
+            <w:numPr>
+              <w:ilvl w:val="0"/>
+              <w:numId w:val="21"/>
+            </w:numPr>
             <w:tabs>
               <w:tab w:val="right" w:leader="dot" w:pos="10456"/>
             </w:tabs>
@@ -527,7 +546,6 @@
               <w:b/>
               <w:noProof/>
               <w:color w:val="1F4E79" w:themeColor="accent5" w:themeShade="80"/>
-              <w:sz w:val="20"/>
               <w:lang w:val="en-IN" w:eastAsia="en-IN"/>
             </w:rPr>
           </w:pPr>
@@ -539,7 +557,7 @@
                 <w:b/>
                 <w:noProof/>
                 <w:color w:val="1F4E79" w:themeColor="accent5" w:themeShade="80"/>
-                <w:sz w:val="24"/>
+                <w:sz w:val="28"/>
               </w:rPr>
               <w:t>Coding Questions</w:t>
             </w:r>
@@ -549,7 +567,7 @@
                 <w:noProof/>
                 <w:webHidden/>
                 <w:color w:val="1F4E79" w:themeColor="accent5" w:themeShade="80"/>
-                <w:sz w:val="24"/>
+                <w:sz w:val="28"/>
               </w:rPr>
               <w:tab/>
             </w:r>
@@ -559,7 +577,7 @@
                 <w:noProof/>
                 <w:webHidden/>
                 <w:color w:val="1F4E79" w:themeColor="accent5" w:themeShade="80"/>
-                <w:sz w:val="24"/>
+                <w:sz w:val="28"/>
               </w:rPr>
               <w:fldChar w:fldCharType="begin"/>
             </w:r>
@@ -569,7 +587,7 @@
                 <w:noProof/>
                 <w:webHidden/>
                 <w:color w:val="1F4E79" w:themeColor="accent5" w:themeShade="80"/>
-                <w:sz w:val="24"/>
+                <w:sz w:val="28"/>
               </w:rPr>
               <w:instrText xml:space="preserve"> PAGEREF _Toc240363952 \h </w:instrText>
             </w:r>
@@ -579,7 +597,7 @@
                 <w:noProof/>
                 <w:webHidden/>
                 <w:color w:val="1F4E79" w:themeColor="accent5" w:themeShade="80"/>
-                <w:sz w:val="24"/>
+                <w:sz w:val="28"/>
               </w:rPr>
             </w:r>
             <w:r>
@@ -588,7 +606,7 @@
                 <w:noProof/>
                 <w:webHidden/>
                 <w:color w:val="1F4E79" w:themeColor="accent5" w:themeShade="80"/>
-                <w:sz w:val="24"/>
+                <w:sz w:val="28"/>
               </w:rPr>
               <w:fldChar w:fldCharType="separate"/>
             </w:r>
@@ -598,7 +616,7 @@
                 <w:noProof/>
                 <w:webHidden/>
                 <w:color w:val="1F4E79" w:themeColor="accent5" w:themeShade="80"/>
-                <w:sz w:val="24"/>
+                <w:sz w:val="28"/>
               </w:rPr>
               <w:t>6</w:t>
             </w:r>
@@ -608,7 +626,7 @@
                 <w:noProof/>
                 <w:webHidden/>
                 <w:color w:val="1F4E79" w:themeColor="accent5" w:themeShade="80"/>
-                <w:sz w:val="24"/>
+                <w:sz w:val="28"/>
               </w:rPr>
               <w:fldChar w:fldCharType="end"/>
             </w:r>
@@ -620,7 +638,7 @@
               <w:bCs/>
               <w:noProof/>
               <w:color w:val="1F4E79" w:themeColor="accent5" w:themeShade="80"/>
-              <w:sz w:val="28"/>
+              <w:sz w:val="32"/>
             </w:rPr>
             <w:fldChar w:fldCharType="end"/>
           </w:r>
@@ -1641,14 +1659,7 @@
           <w:rFonts w:ascii="Comic Sans MS" w:hAnsi="Comic Sans MS" w:cs="Segoe UI Symbol"/>
           <w:sz w:val="28"/>
         </w:rPr>
-        <w:t>Q</w:t>
-      </w:r>
-      <w:r>
-        <w:rPr>
-          <w:rFonts w:ascii="Comic Sans MS" w:hAnsi="Comic Sans MS" w:cs="Segoe UI Symbol"/>
-          <w:sz w:val="28"/>
-        </w:rPr>
-        <w:t>2</w:t>
+        <w:t>Q2</w:t>
       </w:r>
       <w:r>
         <w:rPr>
@@ -5517,7 +5528,18 @@
                 <w:szCs w:val="24"/>
                 <w:lang w:eastAsia="en-IN"/>
               </w:rPr>
-              <w:t>One sort order only</w:t>
+              <w:t>One sort order on</w:t>
+            </w:r>
+            <w:bookmarkStart w:id="3" w:name="_GoBack"/>
+            <w:bookmarkEnd w:id="3"/>
+            <w:r>
+              <w:rPr>
+                <w:rFonts w:ascii="Comic Sans MS" w:eastAsia="Times New Roman" w:hAnsi="Comic Sans MS" w:cstheme="majorHAnsi"/>
+                <w:bCs/>
+                <w:szCs w:val="24"/>
+                <w:lang w:eastAsia="en-IN"/>
+              </w:rPr>
+              <w:t>ly</w:t>
             </w:r>
           </w:p>
         </w:tc>
@@ -5782,14 +5804,7 @@
           <w:sz w:val="28"/>
         </w:rPr>
         <w:lastRenderedPageBreak/>
-        <w:t>Q</w:t>
-      </w:r>
-      <w:r>
-        <w:rPr>
-          <w:rFonts w:ascii="Comic Sans MS" w:hAnsi="Comic Sans MS" w:cs="Segoe UI Symbol"/>
-          <w:sz w:val="28"/>
-        </w:rPr>
-        <w:t>3</w:t>
+        <w:t>Q3</w:t>
       </w:r>
       <w:r>
         <w:rPr>
@@ -8875,7 +8890,7 @@
           <w:u w:val="single"/>
         </w:rPr>
       </w:pPr>
-      <w:bookmarkStart w:id="3" w:name="_Toc240363946"/>
+      <w:bookmarkStart w:id="4" w:name="_Toc240363946"/>
       <w:r>
         <w:rPr>
           <w:rFonts w:ascii="Comic Sans MS" w:hAnsi="Comic Sans MS"/>
@@ -8887,7 +8902,7 @@
         <w:lastRenderedPageBreak/>
         <w:t>Lambda</w:t>
       </w:r>
-      <w:bookmarkEnd w:id="3"/>
+      <w:bookmarkEnd w:id="4"/>
     </w:p>
     <w:p>
       <w:pPr>
@@ -8917,9 +8932,9 @@
           <w:sz w:val="28"/>
         </w:rPr>
       </w:pPr>
-      <w:bookmarkStart w:id="4" w:name="_Toc240191817"/>
-      <w:bookmarkStart w:id="5" w:name="_Toc240300717"/>
-      <w:bookmarkStart w:id="6" w:name="_Toc240363947"/>
+      <w:bookmarkStart w:id="5" w:name="_Toc240191817"/>
+      <w:bookmarkStart w:id="6" w:name="_Toc240300717"/>
+      <w:bookmarkStart w:id="7" w:name="_Toc240363947"/>
       <w:r>
         <w:rPr>
           <w:rFonts w:ascii="Comic Sans MS" w:hAnsi="Comic Sans MS" w:cs="Segoe UI Symbol"/>
@@ -8934,9 +8949,9 @@
         </w:rPr>
         <w:t xml:space="preserve">. </w:t>
       </w:r>
-      <w:bookmarkEnd w:id="4"/>
       <w:bookmarkEnd w:id="5"/>
       <w:bookmarkEnd w:id="6"/>
+      <w:bookmarkEnd w:id="7"/>
       <w:r>
         <w:rPr>
           <w:rFonts w:ascii="Comic Sans MS" w:hAnsi="Comic Sans MS" w:cs="Segoe UI Symbol"/>
@@ -9383,7 +9398,7 @@
           <w:u w:val="single"/>
         </w:rPr>
       </w:pPr>
-      <w:bookmarkStart w:id="7" w:name="_Toc240363948"/>
+      <w:bookmarkStart w:id="8" w:name="_Toc240363948"/>
       <w:r>
         <w:rPr>
           <w:rFonts w:ascii="Comic Sans MS" w:hAnsi="Comic Sans MS"/>
@@ -9395,7 +9410,7 @@
         <w:lastRenderedPageBreak/>
         <w:t>Streams</w:t>
       </w:r>
-      <w:bookmarkEnd w:id="7"/>
+      <w:bookmarkEnd w:id="8"/>
     </w:p>
     <w:p>
       <w:pPr>
@@ -9427,7 +9442,7 @@
           <w:lang w:eastAsia="en-IN"/>
         </w:rPr>
       </w:pPr>
-      <w:bookmarkStart w:id="8" w:name="_Toc240363949"/>
+      <w:bookmarkStart w:id="9" w:name="_Toc240363949"/>
       <w:r>
         <w:rPr>
           <w:rFonts w:ascii="Comic Sans MS" w:hAnsi="Comic Sans MS" w:cs="Segoe UI Symbol"/>
@@ -9442,7 +9457,7 @@
         </w:rPr>
         <w:t xml:space="preserve">. </w:t>
       </w:r>
-      <w:bookmarkEnd w:id="8"/>
+      <w:bookmarkEnd w:id="9"/>
       <w:r>
         <w:rPr>
           <w:rFonts w:ascii="Comic Sans MS" w:hAnsi="Comic Sans MS" w:cs="Segoe UI Symbol"/>
@@ -12243,7 +12258,7 @@
           <w:u w:val="single"/>
         </w:rPr>
       </w:pPr>
-      <w:bookmarkStart w:id="9" w:name="_Toc240363950"/>
+      <w:bookmarkStart w:id="10" w:name="_Toc240363950"/>
       <w:r>
         <w:rPr>
           <w:rFonts w:ascii="Comic Sans MS" w:hAnsi="Comic Sans MS"/>
@@ -12255,7 +12270,7 @@
         <w:lastRenderedPageBreak/>
         <w:t>Optional</w:t>
       </w:r>
-      <w:bookmarkEnd w:id="9"/>
+      <w:bookmarkEnd w:id="10"/>
     </w:p>
     <w:p>
       <w:pPr>
@@ -12719,7 +12734,7 @@
           <w:u w:val="single"/>
         </w:rPr>
       </w:pPr>
-      <w:bookmarkStart w:id="10" w:name="_Toc240363952"/>
+      <w:bookmarkStart w:id="11" w:name="_Toc240363952"/>
       <w:r>
         <w:rPr>
           <w:rFonts w:ascii="Comic Sans MS" w:hAnsi="Comic Sans MS"/>
@@ -12731,7 +12746,7 @@
         <w:lastRenderedPageBreak/>
         <w:t>Coding Questions</w:t>
       </w:r>
-      <w:bookmarkEnd w:id="10"/>
+      <w:bookmarkEnd w:id="11"/>
     </w:p>
     <w:p>
       <w:pPr>
@@ -17606,8 +17621,6 @@
           <w:lang w:eastAsia="en-IN"/>
         </w:rPr>
       </w:pPr>
-      <w:bookmarkStart w:id="11" w:name="_GoBack"/>
-      <w:bookmarkEnd w:id="11"/>
     </w:p>
     <w:p>
       <w:pPr>
@@ -17984,14 +17997,7 @@
         <w:noProof/>
         <w:color w:val="385623" w:themeColor="accent6" w:themeShade="80"/>
       </w:rPr>
-      <w:t xml:space="preserve">Java </w:t>
-    </w:r>
-    <w:r>
-      <w:rPr>
-        <w:noProof/>
-        <w:color w:val="385623" w:themeColor="accent6" w:themeShade="80"/>
-      </w:rPr>
-      <w:t>Collections</w:t>
+      <w:t>Functional Programming</w:t>
     </w:r>
     <w:r>
       <w:rPr>
@@ -18033,7 +18039,7 @@
         <w:noProof/>
         <w:color w:val="385623" w:themeColor="accent6" w:themeShade="80"/>
       </w:rPr>
-      <w:t>10</w:t>
+      <w:t>11</w:t>
     </w:r>
     <w:r>
       <w:rPr>
@@ -19869,9 +19875,9 @@
     </w:lvl>
   </w:abstractNum>
   <w:abstractNum w:abstractNumId="17" w15:restartNumberingAfterBreak="0">
-    <w:nsid w:val="79297259"/>
+    <w:nsid w:val="76B31071"/>
     <w:multiLevelType w:val="hybridMultilevel"/>
-    <w:tmpl w:val="01EC0DBE"/>
+    <w:tmpl w:val="EE84C338"/>
     <w:lvl w:ilvl="0" w:tplc="40090001">
       <w:start w:val="1"/>
       <w:numFmt w:val="bullet"/>
@@ -19982,9 +19988,9 @@
     </w:lvl>
   </w:abstractNum>
   <w:abstractNum w:abstractNumId="18" w15:restartNumberingAfterBreak="0">
-    <w:nsid w:val="7CB57F63"/>
+    <w:nsid w:val="79297259"/>
     <w:multiLevelType w:val="hybridMultilevel"/>
-    <w:tmpl w:val="9E466908"/>
+    <w:tmpl w:val="01EC0DBE"/>
     <w:lvl w:ilvl="0" w:tplc="40090001">
       <w:start w:val="1"/>
       <w:numFmt w:val="bullet"/>
@@ -20095,6 +20101,119 @@
     </w:lvl>
   </w:abstractNum>
   <w:abstractNum w:abstractNumId="19" w15:restartNumberingAfterBreak="0">
+    <w:nsid w:val="7CB57F63"/>
+    <w:multiLevelType w:val="hybridMultilevel"/>
+    <w:tmpl w:val="9E466908"/>
+    <w:lvl w:ilvl="0" w:tplc="40090001">
+      <w:start w:val="1"/>
+      <w:numFmt w:val="bullet"/>
+      <w:lvlText w:val=""/>
+      <w:lvlJc w:val="left"/>
+      <w:pPr>
+        <w:ind w:left="360" w:hanging="360"/>
+      </w:pPr>
+      <w:rPr>
+        <w:rFonts w:ascii="Symbol" w:hAnsi="Symbol" w:hint="default"/>
+      </w:rPr>
+    </w:lvl>
+    <w:lvl w:ilvl="1" w:tplc="40090003" w:tentative="1">
+      <w:start w:val="1"/>
+      <w:numFmt w:val="bullet"/>
+      <w:lvlText w:val="o"/>
+      <w:lvlJc w:val="left"/>
+      <w:pPr>
+        <w:ind w:left="1080" w:hanging="360"/>
+      </w:pPr>
+      <w:rPr>
+        <w:rFonts w:ascii="Courier New" w:hAnsi="Courier New" w:cs="Courier New" w:hint="default"/>
+      </w:rPr>
+    </w:lvl>
+    <w:lvl w:ilvl="2" w:tplc="40090005" w:tentative="1">
+      <w:start w:val="1"/>
+      <w:numFmt w:val="bullet"/>
+      <w:lvlText w:val=""/>
+      <w:lvlJc w:val="left"/>
+      <w:pPr>
+        <w:ind w:left="1800" w:hanging="360"/>
+      </w:pPr>
+      <w:rPr>
+        <w:rFonts w:ascii="Wingdings" w:hAnsi="Wingdings" w:hint="default"/>
+      </w:rPr>
+    </w:lvl>
+    <w:lvl w:ilvl="3" w:tplc="40090001" w:tentative="1">
+      <w:start w:val="1"/>
+      <w:numFmt w:val="bullet"/>
+      <w:lvlText w:val=""/>
+      <w:lvlJc w:val="left"/>
+      <w:pPr>
+        <w:ind w:left="2520" w:hanging="360"/>
+      </w:pPr>
+      <w:rPr>
+        <w:rFonts w:ascii="Symbol" w:hAnsi="Symbol" w:hint="default"/>
+      </w:rPr>
+    </w:lvl>
+    <w:lvl w:ilvl="4" w:tplc="40090003" w:tentative="1">
+      <w:start w:val="1"/>
+      <w:numFmt w:val="bullet"/>
+      <w:lvlText w:val="o"/>
+      <w:lvlJc w:val="left"/>
+      <w:pPr>
+        <w:ind w:left="3240" w:hanging="360"/>
+      </w:pPr>
+      <w:rPr>
+        <w:rFonts w:ascii="Courier New" w:hAnsi="Courier New" w:cs="Courier New" w:hint="default"/>
+      </w:rPr>
+    </w:lvl>
+    <w:lvl w:ilvl="5" w:tplc="40090005" w:tentative="1">
+      <w:start w:val="1"/>
+      <w:numFmt w:val="bullet"/>
+      <w:lvlText w:val=""/>
+      <w:lvlJc w:val="left"/>
+      <w:pPr>
+        <w:ind w:left="3960" w:hanging="360"/>
+      </w:pPr>
+      <w:rPr>
+        <w:rFonts w:ascii="Wingdings" w:hAnsi="Wingdings" w:hint="default"/>
+      </w:rPr>
+    </w:lvl>
+    <w:lvl w:ilvl="6" w:tplc="40090001" w:tentative="1">
+      <w:start w:val="1"/>
+      <w:numFmt w:val="bullet"/>
+      <w:lvlText w:val=""/>
+      <w:lvlJc w:val="left"/>
+      <w:pPr>
+        <w:ind w:left="4680" w:hanging="360"/>
+      </w:pPr>
+      <w:rPr>
+        <w:rFonts w:ascii="Symbol" w:hAnsi="Symbol" w:hint="default"/>
+      </w:rPr>
+    </w:lvl>
+    <w:lvl w:ilvl="7" w:tplc="40090003" w:tentative="1">
+      <w:start w:val="1"/>
+      <w:numFmt w:val="bullet"/>
+      <w:lvlText w:val="o"/>
+      <w:lvlJc w:val="left"/>
+      <w:pPr>
+        <w:ind w:left="5400" w:hanging="360"/>
+      </w:pPr>
+      <w:rPr>
+        <w:rFonts w:ascii="Courier New" w:hAnsi="Courier New" w:cs="Courier New" w:hint="default"/>
+      </w:rPr>
+    </w:lvl>
+    <w:lvl w:ilvl="8" w:tplc="40090005" w:tentative="1">
+      <w:start w:val="1"/>
+      <w:numFmt w:val="bullet"/>
+      <w:lvlText w:val=""/>
+      <w:lvlJc w:val="left"/>
+      <w:pPr>
+        <w:ind w:left="6120" w:hanging="360"/>
+      </w:pPr>
+      <w:rPr>
+        <w:rFonts w:ascii="Wingdings" w:hAnsi="Wingdings" w:hint="default"/>
+      </w:rPr>
+    </w:lvl>
+  </w:abstractNum>
+  <w:abstractNum w:abstractNumId="20" w15:restartNumberingAfterBreak="0">
     <w:nsid w:val="7D4A4EB4"/>
     <w:multiLevelType w:val="multilevel"/>
     <w:tmpl w:val="213C7FE2"/>
@@ -20268,7 +20387,7 @@
     <w:abstractNumId w:val="9"/>
   </w:num>
   <w:num w:numId="9">
-    <w:abstractNumId w:val="18"/>
+    <w:abstractNumId w:val="19"/>
   </w:num>
   <w:num w:numId="10">
     <w:abstractNumId w:val="1"/>
@@ -20277,7 +20396,7 @@
     <w:abstractNumId w:val="16"/>
   </w:num>
   <w:num w:numId="12">
-    <w:abstractNumId w:val="17"/>
+    <w:abstractNumId w:val="18"/>
   </w:num>
   <w:num w:numId="13">
     <w:abstractNumId w:val="8"/>
@@ -20301,7 +20420,10 @@
     <w:abstractNumId w:val="14"/>
   </w:num>
   <w:num w:numId="20">
-    <w:abstractNumId w:val="19"/>
+    <w:abstractNumId w:val="20"/>
+  </w:num>
+  <w:num w:numId="21">
+    <w:abstractNumId w:val="17"/>
   </w:num>
   <w:numIdMacAtCleanup w:val="12"/>
 </w:numbering>
@@ -20814,6 +20936,7 @@
   <w:style w:type="character" w:default="1" w:styleId="DefaultParagraphFont">
     <w:name w:val="Default Paragraph Font"/>
     <w:uiPriority w:val="1"/>
+    <w:semiHidden/>
     <w:unhideWhenUsed/>
   </w:style>
   <w:style w:type="table" w:default="1" w:styleId="TableNormal">
@@ -21534,7 +21657,7 @@
 </file>
 
 <file path=customXml/itemProps1.xml><?xml version="1.0" encoding="utf-8"?>
-<ds:datastoreItem xmlns:ds="http://schemas.openxmlformats.org/officeDocument/2006/customXml" ds:itemID="{D6A81A99-1D24-4634-9C8D-3CAFAC1238AF}">
+<ds:datastoreItem xmlns:ds="http://schemas.openxmlformats.org/officeDocument/2006/customXml" ds:itemID="{4350342D-E464-415A-A696-F9F0FF03BC4B}">
   <ds:schemaRefs>
     <ds:schemaRef ds:uri="http://schemas.openxmlformats.org/officeDocument/2006/bibliography"/>
   </ds:schemaRefs>

</xml_diff>